<commit_message>
feat: add inventory and desktop maintenance document templates to resources
</commit_message>
<xml_diff>
--- a/backend/resources/template_mant_desktop.docx
+++ b/backend/resources/template_mant_desktop.docx
@@ -10,7 +10,7 @@
         <mc:AlternateContent>
           <mc:Choice Requires="wpg">
             <w:drawing>
-              <wp:inline distT="0" distB="0" distL="0" distR="0" wp14:anchorId="704790CB" wp14:editId="6242CDCF">
+              <wp:inline distT="0" distB="0" distL="0" distR="0" wp14:anchorId="704790CB" wp14:editId="5FBF9691">
                 <wp:extent cx="6867525" cy="496570"/>
                 <wp:effectExtent l="0" t="0" r="9525" b="0"/>
                 <wp:docPr id="2819" name="Group 2819"/>
@@ -77,7 +77,7 @@
           </mc:Choice>
           <mc:Fallback>
             <w:pict>
-              <v:group w14:anchorId="17DC6304" id="Group 2819" o:spid="_x0000_s1026" style="width:540.75pt;height:39.1pt;mso-position-horizontal-relative:char;mso-position-vertical-relative:line" coordorigin="-380,-8792" coordsize="91491,6584" o:gfxdata="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">
+              <v:group w14:anchorId="74802DCD" id="Group 2819" o:spid="_x0000_s1026" style="width:540.75pt;height:39.1pt;mso-position-horizontal-relative:char;mso-position-vertical-relative:line" coordorigin="-380,-8792" coordsize="91491,6584" o:gfxdata="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">
                 <v:shapetype id="_x0000_t75" coordsize="21600,21600" o:spt="75" o:preferrelative="t" path="m@4@5l@4@11@9@11@9@5xe" filled="f" stroked="f">
                   <v:stroke joinstyle="miter"/>
                   <v:formulas>
@@ -128,23 +128,17 @@
         <w:tblLook w:val="04A0" w:firstRow="1" w:lastRow="0" w:firstColumn="1" w:lastColumn="0" w:noHBand="0" w:noVBand="1"/>
       </w:tblPr>
       <w:tblGrid>
-        <w:gridCol w:w="1047"/>
-        <w:gridCol w:w="1597"/>
-        <w:gridCol w:w="2068"/>
-        <w:gridCol w:w="327"/>
-        <w:gridCol w:w="326"/>
-        <w:gridCol w:w="326"/>
-        <w:gridCol w:w="1299"/>
-        <w:gridCol w:w="1263"/>
-        <w:gridCol w:w="2537"/>
+        <w:gridCol w:w="1202"/>
+        <w:gridCol w:w="1491"/>
+        <w:gridCol w:w="2397"/>
+        <w:gridCol w:w="314"/>
+        <w:gridCol w:w="313"/>
+        <w:gridCol w:w="313"/>
+        <w:gridCol w:w="1212"/>
+        <w:gridCol w:w="1179"/>
+        <w:gridCol w:w="2369"/>
       </w:tblGrid>
       <w:tr>
-        <w:tblPrEx>
-          <w:tblCellMar>
-            <w:top w:w="0" w:type="dxa"/>
-            <w:bottom w:w="0" w:type="dxa"/>
-          </w:tblCellMar>
-        </w:tblPrEx>
         <w:tc>
           <w:tcPr>
             <w:tcW w:w="0" w:type="auto"/>
@@ -188,12 +182,6 @@
         </w:tc>
       </w:tr>
       <w:tr>
-        <w:tblPrEx>
-          <w:tblCellMar>
-            <w:top w:w="0" w:type="dxa"/>
-            <w:bottom w:w="0" w:type="dxa"/>
-          </w:tblCellMar>
-        </w:tblPrEx>
         <w:tc>
           <w:tcPr>
             <w:tcW w:w="0" w:type="auto"/>
@@ -216,8 +204,8 @@
             <w:pPr>
               <w:rPr>
                 <w:rFonts w:ascii="Arial" w:hAnsi="Arial" w:cs="Arial"/>
-                <w:sz w:val="14"/>
-                <w:szCs w:val="14"/>
+                <w:sz w:val="18"/>
+                <w:szCs w:val="18"/>
               </w:rPr>
             </w:pPr>
             <w:r>
@@ -225,8 +213,8 @@
                 <w:rFonts w:ascii="Arial" w:eastAsia="Arial" w:hAnsi="Arial" w:cs="Arial"/>
                 <w:b/>
                 <w:bCs/>
-                <w:sz w:val="14"/>
-                <w:szCs w:val="14"/>
+                <w:sz w:val="18"/>
+                <w:szCs w:val="18"/>
               </w:rPr>
               <w:t>Sede</w:t>
             </w:r>
@@ -254,15 +242,15 @@
             <w:pPr>
               <w:rPr>
                 <w:rFonts w:ascii="Arial" w:hAnsi="Arial" w:cs="Arial"/>
-                <w:sz w:val="14"/>
-                <w:szCs w:val="14"/>
-              </w:rPr>
-            </w:pPr>
-            <w:r>
-              <w:rPr>
-                <w:rFonts w:ascii="Arial" w:eastAsia="Arial" w:hAnsi="Arial" w:cs="Arial"/>
-                <w:sz w:val="14"/>
-                <w:szCs w:val="14"/>
+                <w:sz w:val="18"/>
+                <w:szCs w:val="18"/>
+              </w:rPr>
+            </w:pPr>
+            <w:r>
+              <w:rPr>
+                <w:rFonts w:ascii="Arial" w:eastAsia="Arial" w:hAnsi="Arial" w:cs="Arial"/>
+                <w:sz w:val="18"/>
+                <w:szCs w:val="18"/>
               </w:rPr>
               <w:t>{sede}</w:t>
             </w:r>
@@ -329,12 +317,6 @@
         </w:tc>
       </w:tr>
       <w:tr>
-        <w:tblPrEx>
-          <w:tblCellMar>
-            <w:top w:w="0" w:type="dxa"/>
-            <w:bottom w:w="0" w:type="dxa"/>
-          </w:tblCellMar>
-        </w:tblPrEx>
         <w:tc>
           <w:tcPr>
             <w:tcW w:w="0" w:type="auto"/>
@@ -357,8 +339,8 @@
             <w:pPr>
               <w:rPr>
                 <w:rFonts w:ascii="Arial" w:hAnsi="Arial" w:cs="Arial"/>
-                <w:sz w:val="14"/>
-                <w:szCs w:val="14"/>
+                <w:sz w:val="18"/>
+                <w:szCs w:val="18"/>
               </w:rPr>
             </w:pPr>
             <w:r>
@@ -366,8 +348,8 @@
                 <w:rFonts w:ascii="Arial" w:eastAsia="Arial" w:hAnsi="Arial" w:cs="Arial"/>
                 <w:b/>
                 <w:bCs/>
-                <w:sz w:val="14"/>
-                <w:szCs w:val="14"/>
+                <w:sz w:val="18"/>
+                <w:szCs w:val="18"/>
               </w:rPr>
               <w:t>Área</w:t>
             </w:r>
@@ -395,15 +377,15 @@
             <w:pPr>
               <w:rPr>
                 <w:rFonts w:ascii="Arial" w:hAnsi="Arial" w:cs="Arial"/>
-                <w:sz w:val="14"/>
-                <w:szCs w:val="14"/>
-              </w:rPr>
-            </w:pPr>
-            <w:r>
-              <w:rPr>
-                <w:rFonts w:ascii="Arial" w:eastAsia="Arial" w:hAnsi="Arial" w:cs="Arial"/>
-                <w:sz w:val="14"/>
-                <w:szCs w:val="14"/>
+                <w:sz w:val="18"/>
+                <w:szCs w:val="18"/>
+              </w:rPr>
+            </w:pPr>
+            <w:r>
+              <w:rPr>
+                <w:rFonts w:ascii="Arial" w:eastAsia="Arial" w:hAnsi="Arial" w:cs="Arial"/>
+                <w:sz w:val="18"/>
+                <w:szCs w:val="18"/>
               </w:rPr>
               <w:t>{</w:t>
             </w:r>
@@ -411,8 +393,8 @@
             <w:r>
               <w:rPr>
                 <w:rFonts w:ascii="Arial" w:eastAsia="Arial" w:hAnsi="Arial" w:cs="Arial"/>
-                <w:sz w:val="14"/>
-                <w:szCs w:val="14"/>
+                <w:sz w:val="18"/>
+                <w:szCs w:val="18"/>
               </w:rPr>
               <w:t>area</w:t>
             </w:r>
@@ -420,8 +402,8 @@
             <w:r>
               <w:rPr>
                 <w:rFonts w:ascii="Arial" w:eastAsia="Arial" w:hAnsi="Arial" w:cs="Arial"/>
-                <w:sz w:val="14"/>
-                <w:szCs w:val="14"/>
+                <w:sz w:val="18"/>
+                <w:szCs w:val="18"/>
               </w:rPr>
               <w:t>}</w:t>
             </w:r>
@@ -429,12 +411,6 @@
         </w:tc>
       </w:tr>
       <w:tr>
-        <w:tblPrEx>
-          <w:tblCellMar>
-            <w:top w:w="0" w:type="dxa"/>
-            <w:bottom w:w="0" w:type="dxa"/>
-          </w:tblCellMar>
-        </w:tblPrEx>
         <w:tc>
           <w:tcPr>
             <w:tcW w:w="0" w:type="auto"/>
@@ -457,8 +433,8 @@
             <w:pPr>
               <w:rPr>
                 <w:rFonts w:ascii="Arial" w:hAnsi="Arial" w:cs="Arial"/>
-                <w:sz w:val="14"/>
-                <w:szCs w:val="14"/>
+                <w:sz w:val="18"/>
+                <w:szCs w:val="18"/>
               </w:rPr>
             </w:pPr>
             <w:r>
@@ -466,8 +442,8 @@
                 <w:rFonts w:ascii="Arial" w:eastAsia="Arial" w:hAnsi="Arial" w:cs="Arial"/>
                 <w:b/>
                 <w:bCs/>
-                <w:sz w:val="14"/>
-                <w:szCs w:val="14"/>
+                <w:sz w:val="18"/>
+                <w:szCs w:val="18"/>
               </w:rPr>
               <w:t>Usuario</w:t>
             </w:r>
@@ -495,15 +471,15 @@
             <w:pPr>
               <w:rPr>
                 <w:rFonts w:ascii="Arial" w:hAnsi="Arial" w:cs="Arial"/>
-                <w:sz w:val="14"/>
-                <w:szCs w:val="14"/>
-              </w:rPr>
-            </w:pPr>
-            <w:r>
-              <w:rPr>
-                <w:rFonts w:ascii="Arial" w:eastAsia="Arial" w:hAnsi="Arial" w:cs="Arial"/>
-                <w:sz w:val="14"/>
-                <w:szCs w:val="14"/>
+                <w:sz w:val="18"/>
+                <w:szCs w:val="18"/>
+              </w:rPr>
+            </w:pPr>
+            <w:r>
+              <w:rPr>
+                <w:rFonts w:ascii="Arial" w:eastAsia="Arial" w:hAnsi="Arial" w:cs="Arial"/>
+                <w:sz w:val="18"/>
+                <w:szCs w:val="18"/>
               </w:rPr>
               <w:t>{usuario}</w:t>
             </w:r>
@@ -511,12 +487,6 @@
         </w:tc>
       </w:tr>
       <w:tr>
-        <w:tblPrEx>
-          <w:tblCellMar>
-            <w:top w:w="0" w:type="dxa"/>
-            <w:bottom w:w="0" w:type="dxa"/>
-          </w:tblCellMar>
-        </w:tblPrEx>
         <w:tc>
           <w:tcPr>
             <w:tcW w:w="0" w:type="auto"/>
@@ -539,8 +509,8 @@
             <w:pPr>
               <w:rPr>
                 <w:rFonts w:ascii="Arial" w:hAnsi="Arial" w:cs="Arial"/>
-                <w:sz w:val="14"/>
-                <w:szCs w:val="14"/>
+                <w:sz w:val="18"/>
+                <w:szCs w:val="18"/>
               </w:rPr>
             </w:pPr>
             <w:r>
@@ -548,8 +518,8 @@
                 <w:rFonts w:ascii="Arial" w:eastAsia="Arial" w:hAnsi="Arial" w:cs="Arial"/>
                 <w:b/>
                 <w:bCs/>
-                <w:sz w:val="14"/>
-                <w:szCs w:val="14"/>
+                <w:sz w:val="18"/>
+                <w:szCs w:val="18"/>
               </w:rPr>
               <w:t>Motivo</w:t>
             </w:r>
@@ -577,15 +547,15 @@
             <w:pPr>
               <w:rPr>
                 <w:rFonts w:ascii="Arial" w:hAnsi="Arial" w:cs="Arial"/>
-                <w:sz w:val="14"/>
-                <w:szCs w:val="14"/>
-              </w:rPr>
-            </w:pPr>
-            <w:r>
-              <w:rPr>
-                <w:rFonts w:ascii="Arial" w:eastAsia="Arial" w:hAnsi="Arial" w:cs="Arial"/>
-                <w:sz w:val="14"/>
-                <w:szCs w:val="14"/>
+                <w:sz w:val="18"/>
+                <w:szCs w:val="18"/>
+              </w:rPr>
+            </w:pPr>
+            <w:r>
+              <w:rPr>
+                <w:rFonts w:ascii="Arial" w:eastAsia="Arial" w:hAnsi="Arial" w:cs="Arial"/>
+                <w:sz w:val="18"/>
+                <w:szCs w:val="18"/>
               </w:rPr>
               <w:t>{motivo}</w:t>
             </w:r>
@@ -593,12 +563,6 @@
         </w:tc>
       </w:tr>
       <w:tr>
-        <w:tblPrEx>
-          <w:tblCellMar>
-            <w:top w:w="0" w:type="dxa"/>
-            <w:bottom w:w="0" w:type="dxa"/>
-          </w:tblCellMar>
-        </w:tblPrEx>
         <w:tc>
           <w:tcPr>
             <w:tcW w:w="0" w:type="auto"/>
@@ -621,8 +585,8 @@
             <w:pPr>
               <w:rPr>
                 <w:rFonts w:ascii="Arial" w:hAnsi="Arial" w:cs="Arial"/>
-                <w:sz w:val="14"/>
-                <w:szCs w:val="14"/>
+                <w:sz w:val="18"/>
+                <w:szCs w:val="18"/>
               </w:rPr>
             </w:pPr>
             <w:r>
@@ -630,8 +594,8 @@
                 <w:rFonts w:ascii="Arial" w:eastAsia="Arial" w:hAnsi="Arial" w:cs="Arial"/>
                 <w:b/>
                 <w:bCs/>
-                <w:sz w:val="14"/>
-                <w:szCs w:val="14"/>
+                <w:sz w:val="18"/>
+                <w:szCs w:val="18"/>
               </w:rPr>
               <w:t>Referencia</w:t>
             </w:r>
@@ -659,15 +623,15 @@
             <w:pPr>
               <w:rPr>
                 <w:rFonts w:ascii="Arial" w:hAnsi="Arial" w:cs="Arial"/>
-                <w:sz w:val="14"/>
-                <w:szCs w:val="14"/>
-              </w:rPr>
-            </w:pPr>
-            <w:r>
-              <w:rPr>
-                <w:rFonts w:ascii="Arial" w:eastAsia="Arial" w:hAnsi="Arial" w:cs="Arial"/>
-                <w:sz w:val="14"/>
-                <w:szCs w:val="14"/>
+                <w:sz w:val="18"/>
+                <w:szCs w:val="18"/>
+              </w:rPr>
+            </w:pPr>
+            <w:r>
+              <w:rPr>
+                <w:rFonts w:ascii="Arial" w:eastAsia="Arial" w:hAnsi="Arial" w:cs="Arial"/>
+                <w:sz w:val="18"/>
+                <w:szCs w:val="18"/>
               </w:rPr>
               <w:t>{referencia}</w:t>
             </w:r>
@@ -675,12 +639,6 @@
         </w:tc>
       </w:tr>
       <w:tr>
-        <w:tblPrEx>
-          <w:tblCellMar>
-            <w:top w:w="0" w:type="dxa"/>
-            <w:bottom w:w="0" w:type="dxa"/>
-          </w:tblCellMar>
-        </w:tblPrEx>
         <w:tc>
           <w:tcPr>
             <w:tcW w:w="0" w:type="auto"/>
@@ -723,12 +681,6 @@
         </w:tc>
       </w:tr>
       <w:tr>
-        <w:tblPrEx>
-          <w:tblCellMar>
-            <w:top w:w="0" w:type="dxa"/>
-            <w:bottom w:w="0" w:type="dxa"/>
-          </w:tblCellMar>
-        </w:tblPrEx>
         <w:tc>
           <w:tcPr>
             <w:tcW w:w="0" w:type="auto"/>
@@ -746,6 +698,7 @@
               <w:bottom w:w="60" w:type="dxa"/>
               <w:right w:w="100" w:type="dxa"/>
             </w:tcMar>
+            <w:vAlign w:val="center"/>
           </w:tcPr>
           <w:p>
             <w:pPr>
@@ -826,15 +779,15 @@
           <w:p>
             <w:pPr>
               <w:rPr>
-                <w:sz w:val="14"/>
-                <w:szCs w:val="14"/>
-              </w:rPr>
-            </w:pPr>
-            <w:r>
-              <w:rPr>
-                <w:rFonts w:ascii="Arial" w:eastAsia="Arial" w:hAnsi="Arial" w:cs="Arial"/>
-                <w:sz w:val="14"/>
-                <w:szCs w:val="14"/>
+                <w:sz w:val="18"/>
+                <w:szCs w:val="18"/>
+              </w:rPr>
+            </w:pPr>
+            <w:r>
+              <w:rPr>
+                <w:rFonts w:ascii="Arial" w:eastAsia="Arial" w:hAnsi="Arial" w:cs="Arial"/>
+                <w:sz w:val="18"/>
+                <w:szCs w:val="18"/>
               </w:rPr>
               <w:t>{</w:t>
             </w:r>
@@ -842,8 +795,8 @@
             <w:r>
               <w:rPr>
                 <w:rFonts w:ascii="Arial" w:eastAsia="Arial" w:hAnsi="Arial" w:cs="Arial"/>
-                <w:sz w:val="14"/>
-                <w:szCs w:val="14"/>
+                <w:sz w:val="18"/>
+                <w:szCs w:val="18"/>
               </w:rPr>
               <w:t>cpu_modelo</w:t>
             </w:r>
@@ -851,8 +804,8 @@
             <w:r>
               <w:rPr>
                 <w:rFonts w:ascii="Arial" w:eastAsia="Arial" w:hAnsi="Arial" w:cs="Arial"/>
-                <w:sz w:val="14"/>
-                <w:szCs w:val="14"/>
+                <w:sz w:val="18"/>
+                <w:szCs w:val="18"/>
               </w:rPr>
               <w:t>}</w:t>
             </w:r>
@@ -875,6 +828,7 @@
               <w:bottom w:w="60" w:type="dxa"/>
               <w:right w:w="100" w:type="dxa"/>
             </w:tcMar>
+            <w:vAlign w:val="center"/>
           </w:tcPr>
           <w:p>
             <w:pPr>
@@ -936,10 +890,10 @@
         <w:tc>
           <w:tcPr>
             <w:tcW w:w="0" w:type="auto"/>
-            <w:tcBorders>
-              <w:top w:val="single" w:sz="4" w:space="0" w:color="000000"/>
-              <w:left w:val="single" w:sz="12" w:space="0" w:color="000000"/>
-              <w:bottom w:val="single" w:sz="4" w:space="0" w:color="000000"/>
+            <w:vMerge w:val="restart"/>
+            <w:tcBorders>
+              <w:top w:val="single" w:sz="4" w:space="0" w:color="000000"/>
+              <w:left w:val="single" w:sz="12" w:space="0" w:color="000000"/>
               <w:right w:val="single" w:sz="12" w:space="0" w:color="000000"/>
             </w:tcBorders>
             <w:tcMar>
@@ -1017,12 +971,6 @@
         </w:tc>
       </w:tr>
       <w:tr>
-        <w:tblPrEx>
-          <w:tblCellMar>
-            <w:top w:w="0" w:type="dxa"/>
-            <w:bottom w:w="0" w:type="dxa"/>
-          </w:tblCellMar>
-        </w:tblPrEx>
         <w:tc>
           <w:tcPr>
             <w:tcW w:w="0" w:type="auto"/>
@@ -1033,6 +981,7 @@
               <w:bottom w:val="single" w:sz="4" w:space="0" w:color="000000"/>
               <w:right w:val="single" w:sz="12" w:space="0" w:color="000000"/>
             </w:tcBorders>
+            <w:vAlign w:val="center"/>
           </w:tcPr>
           <w:p>
             <w:pPr>
@@ -1103,15 +1052,15 @@
           <w:p>
             <w:pPr>
               <w:rPr>
-                <w:sz w:val="14"/>
-                <w:szCs w:val="14"/>
-              </w:rPr>
-            </w:pPr>
-            <w:r>
-              <w:rPr>
-                <w:rFonts w:ascii="Arial" w:eastAsia="Arial" w:hAnsi="Arial" w:cs="Arial"/>
-                <w:sz w:val="14"/>
-                <w:szCs w:val="14"/>
+                <w:sz w:val="18"/>
+                <w:szCs w:val="18"/>
+              </w:rPr>
+            </w:pPr>
+            <w:r>
+              <w:rPr>
+                <w:rFonts w:ascii="Arial" w:eastAsia="Arial" w:hAnsi="Arial" w:cs="Arial"/>
+                <w:sz w:val="18"/>
+                <w:szCs w:val="18"/>
               </w:rPr>
               <w:t>{</w:t>
             </w:r>
@@ -1119,8 +1068,8 @@
             <w:r>
               <w:rPr>
                 <w:rFonts w:ascii="Arial" w:eastAsia="Arial" w:hAnsi="Arial" w:cs="Arial"/>
-                <w:sz w:val="14"/>
-                <w:szCs w:val="14"/>
+                <w:sz w:val="18"/>
+                <w:szCs w:val="18"/>
               </w:rPr>
               <w:t>cpu_serie</w:t>
             </w:r>
@@ -1128,8 +1077,8 @@
             <w:r>
               <w:rPr>
                 <w:rFonts w:ascii="Arial" w:eastAsia="Arial" w:hAnsi="Arial" w:cs="Arial"/>
-                <w:sz w:val="14"/>
-                <w:szCs w:val="14"/>
+                <w:sz w:val="18"/>
+                <w:szCs w:val="18"/>
               </w:rPr>
               <w:t>}</w:t>
             </w:r>
@@ -1151,6 +1100,7 @@
               <w:bottom w:w="60" w:type="dxa"/>
               <w:right w:w="100" w:type="dxa"/>
             </w:tcMar>
+            <w:vAlign w:val="center"/>
           </w:tcPr>
           <w:p>
             <w:pPr>
@@ -1202,10 +1152,9 @@
         <w:tc>
           <w:tcPr>
             <w:tcW w:w="0" w:type="auto"/>
-            <w:tcBorders>
-              <w:top w:val="single" w:sz="4" w:space="0" w:color="000000"/>
-              <w:left w:val="single" w:sz="12" w:space="0" w:color="000000"/>
-              <w:bottom w:val="single" w:sz="4" w:space="0" w:color="000000"/>
+            <w:vMerge/>
+            <w:tcBorders>
+              <w:left w:val="single" w:sz="12" w:space="0" w:color="000000"/>
               <w:right w:val="single" w:sz="12" w:space="0" w:color="000000"/>
             </w:tcBorders>
             <w:tcMar>
@@ -1273,12 +1222,6 @@
         </w:tc>
       </w:tr>
       <w:tr>
-        <w:tblPrEx>
-          <w:tblCellMar>
-            <w:top w:w="0" w:type="dxa"/>
-            <w:bottom w:w="0" w:type="dxa"/>
-          </w:tblCellMar>
-        </w:tblPrEx>
         <w:tc>
           <w:tcPr>
             <w:tcW w:w="0" w:type="auto"/>
@@ -1289,6 +1232,7 @@
               <w:bottom w:val="single" w:sz="4" w:space="0" w:color="000000"/>
               <w:right w:val="single" w:sz="12" w:space="0" w:color="000000"/>
             </w:tcBorders>
+            <w:vAlign w:val="center"/>
           </w:tcPr>
           <w:p>
             <w:pPr>
@@ -1359,15 +1303,15 @@
           <w:p>
             <w:pPr>
               <w:rPr>
-                <w:sz w:val="14"/>
-                <w:szCs w:val="14"/>
-              </w:rPr>
-            </w:pPr>
-            <w:r>
-              <w:rPr>
-                <w:rFonts w:ascii="Arial" w:eastAsia="Arial" w:hAnsi="Arial" w:cs="Arial"/>
-                <w:sz w:val="14"/>
-                <w:szCs w:val="14"/>
+                <w:sz w:val="18"/>
+                <w:szCs w:val="18"/>
+              </w:rPr>
+            </w:pPr>
+            <w:r>
+              <w:rPr>
+                <w:rFonts w:ascii="Arial" w:eastAsia="Arial" w:hAnsi="Arial" w:cs="Arial"/>
+                <w:sz w:val="18"/>
+                <w:szCs w:val="18"/>
               </w:rPr>
               <w:t>{</w:t>
             </w:r>
@@ -1375,8 +1319,8 @@
             <w:r>
               <w:rPr>
                 <w:rFonts w:ascii="Arial" w:eastAsia="Arial" w:hAnsi="Arial" w:cs="Arial"/>
-                <w:sz w:val="14"/>
-                <w:szCs w:val="14"/>
+                <w:sz w:val="18"/>
+                <w:szCs w:val="18"/>
               </w:rPr>
               <w:t>cpu_hostname</w:t>
             </w:r>
@@ -1384,8 +1328,8 @@
             <w:r>
               <w:rPr>
                 <w:rFonts w:ascii="Arial" w:eastAsia="Arial" w:hAnsi="Arial" w:cs="Arial"/>
-                <w:sz w:val="14"/>
-                <w:szCs w:val="14"/>
+                <w:sz w:val="18"/>
+                <w:szCs w:val="18"/>
               </w:rPr>
               <w:t>}</w:t>
             </w:r>
@@ -1408,6 +1352,7 @@
               <w:bottom w:w="60" w:type="dxa"/>
               <w:right w:w="100" w:type="dxa"/>
             </w:tcMar>
+            <w:vAlign w:val="center"/>
           </w:tcPr>
           <w:p>
             <w:pPr>
@@ -1459,8 +1404,8 @@
         <w:tc>
           <w:tcPr>
             <w:tcW w:w="0" w:type="auto"/>
-            <w:tcBorders>
-              <w:top w:val="single" w:sz="4" w:space="0" w:color="000000"/>
+            <w:vMerge/>
+            <w:tcBorders>
               <w:left w:val="single" w:sz="12" w:space="0" w:color="000000"/>
               <w:bottom w:val="single" w:sz="4" w:space="0" w:color="000000"/>
               <w:right w:val="single" w:sz="12" w:space="0" w:color="000000"/>
@@ -1530,12 +1475,6 @@
         </w:tc>
       </w:tr>
       <w:tr>
-        <w:tblPrEx>
-          <w:tblCellMar>
-            <w:top w:w="0" w:type="dxa"/>
-            <w:bottom w:w="0" w:type="dxa"/>
-          </w:tblCellMar>
-        </w:tblPrEx>
         <w:tc>
           <w:tcPr>
             <w:tcW w:w="0" w:type="auto"/>
@@ -1553,6 +1492,7 @@
               <w:bottom w:w="60" w:type="dxa"/>
               <w:right w:w="100" w:type="dxa"/>
             </w:tcMar>
+            <w:vAlign w:val="center"/>
           </w:tcPr>
           <w:p>
             <w:pPr>
@@ -1633,8 +1573,8 @@
           <w:p>
             <w:pPr>
               <w:rPr>
-                <w:sz w:val="14"/>
-                <w:szCs w:val="14"/>
+                <w:sz w:val="18"/>
+                <w:szCs w:val="18"/>
               </w:rPr>
             </w:pPr>
             <w:r>
@@ -1642,8 +1582,8 @@
                 <w:rFonts w:ascii="Arial" w:eastAsia="Arial" w:hAnsi="Arial" w:cs="Arial"/>
                 <w:b/>
                 <w:bCs/>
-                <w:sz w:val="14"/>
-                <w:szCs w:val="14"/>
+                <w:sz w:val="18"/>
+                <w:szCs w:val="18"/>
               </w:rPr>
               <w:t>LENOVO</w:t>
             </w:r>
@@ -1666,6 +1606,7 @@
               <w:bottom w:w="60" w:type="dxa"/>
               <w:right w:w="100" w:type="dxa"/>
             </w:tcMar>
+            <w:vAlign w:val="center"/>
           </w:tcPr>
           <w:p>
             <w:pPr>
@@ -1727,10 +1668,10 @@
         <w:tc>
           <w:tcPr>
             <w:tcW w:w="0" w:type="auto"/>
-            <w:tcBorders>
-              <w:top w:val="single" w:sz="4" w:space="0" w:color="000000"/>
-              <w:left w:val="single" w:sz="12" w:space="0" w:color="000000"/>
-              <w:bottom w:val="single" w:sz="4" w:space="0" w:color="000000"/>
+            <w:vMerge w:val="restart"/>
+            <w:tcBorders>
+              <w:top w:val="single" w:sz="4" w:space="0" w:color="000000"/>
+              <w:left w:val="single" w:sz="12" w:space="0" w:color="000000"/>
               <w:right w:val="single" w:sz="12" w:space="0" w:color="000000"/>
             </w:tcBorders>
             <w:tcMar>
@@ -1808,12 +1749,6 @@
         </w:tc>
       </w:tr>
       <w:tr>
-        <w:tblPrEx>
-          <w:tblCellMar>
-            <w:top w:w="0" w:type="dxa"/>
-            <w:bottom w:w="0" w:type="dxa"/>
-          </w:tblCellMar>
-        </w:tblPrEx>
         <w:tc>
           <w:tcPr>
             <w:tcW w:w="0" w:type="auto"/>
@@ -1893,15 +1828,15 @@
           <w:p>
             <w:pPr>
               <w:rPr>
-                <w:sz w:val="14"/>
-                <w:szCs w:val="14"/>
-              </w:rPr>
-            </w:pPr>
-            <w:r>
-              <w:rPr>
-                <w:rFonts w:ascii="Arial" w:eastAsia="Arial" w:hAnsi="Arial" w:cs="Arial"/>
-                <w:sz w:val="14"/>
-                <w:szCs w:val="14"/>
+                <w:sz w:val="18"/>
+                <w:szCs w:val="18"/>
+              </w:rPr>
+            </w:pPr>
+            <w:r>
+              <w:rPr>
+                <w:rFonts w:ascii="Arial" w:eastAsia="Arial" w:hAnsi="Arial" w:cs="Arial"/>
+                <w:sz w:val="18"/>
+                <w:szCs w:val="18"/>
               </w:rPr>
               <w:t>{</w:t>
             </w:r>
@@ -1909,8 +1844,8 @@
             <w:r>
               <w:rPr>
                 <w:rFonts w:ascii="Arial" w:eastAsia="Arial" w:hAnsi="Arial" w:cs="Arial"/>
-                <w:sz w:val="14"/>
-                <w:szCs w:val="14"/>
+                <w:sz w:val="18"/>
+                <w:szCs w:val="18"/>
               </w:rPr>
               <w:t>monitor_modelo</w:t>
             </w:r>
@@ -1918,8 +1853,8 @@
             <w:r>
               <w:rPr>
                 <w:rFonts w:ascii="Arial" w:eastAsia="Arial" w:hAnsi="Arial" w:cs="Arial"/>
-                <w:sz w:val="14"/>
-                <w:szCs w:val="14"/>
+                <w:sz w:val="18"/>
+                <w:szCs w:val="18"/>
               </w:rPr>
               <w:t>}</w:t>
             </w:r>
@@ -1992,10 +1927,9 @@
         <w:tc>
           <w:tcPr>
             <w:tcW w:w="0" w:type="auto"/>
-            <w:tcBorders>
-              <w:top w:val="single" w:sz="4" w:space="0" w:color="000000"/>
-              <w:left w:val="single" w:sz="12" w:space="0" w:color="000000"/>
-              <w:bottom w:val="single" w:sz="4" w:space="0" w:color="000000"/>
+            <w:vMerge/>
+            <w:tcBorders>
+              <w:left w:val="single" w:sz="12" w:space="0" w:color="000000"/>
               <w:right w:val="single" w:sz="12" w:space="0" w:color="000000"/>
             </w:tcBorders>
             <w:tcMar>
@@ -2056,12 +1990,6 @@
         </w:tc>
       </w:tr>
       <w:tr>
-        <w:tblPrEx>
-          <w:tblCellMar>
-            <w:top w:w="0" w:type="dxa"/>
-            <w:bottom w:w="0" w:type="dxa"/>
-          </w:tblCellMar>
-        </w:tblPrEx>
         <w:tc>
           <w:tcPr>
             <w:tcW w:w="0" w:type="auto"/>
@@ -2141,15 +2069,15 @@
           <w:p>
             <w:pPr>
               <w:rPr>
-                <w:sz w:val="14"/>
-                <w:szCs w:val="14"/>
-              </w:rPr>
-            </w:pPr>
-            <w:r>
-              <w:rPr>
-                <w:rFonts w:ascii="Arial" w:eastAsia="Arial" w:hAnsi="Arial" w:cs="Arial"/>
-                <w:sz w:val="14"/>
-                <w:szCs w:val="14"/>
+                <w:sz w:val="18"/>
+                <w:szCs w:val="18"/>
+              </w:rPr>
+            </w:pPr>
+            <w:r>
+              <w:rPr>
+                <w:rFonts w:ascii="Arial" w:eastAsia="Arial" w:hAnsi="Arial" w:cs="Arial"/>
+                <w:sz w:val="18"/>
+                <w:szCs w:val="18"/>
               </w:rPr>
               <w:t>{</w:t>
             </w:r>
@@ -2157,8 +2085,8 @@
             <w:r>
               <w:rPr>
                 <w:rFonts w:ascii="Arial" w:eastAsia="Arial" w:hAnsi="Arial" w:cs="Arial"/>
-                <w:sz w:val="14"/>
-                <w:szCs w:val="14"/>
+                <w:sz w:val="18"/>
+                <w:szCs w:val="18"/>
               </w:rPr>
               <w:t>monitor_serie</w:t>
             </w:r>
@@ -2166,8 +2094,8 @@
             <w:r>
               <w:rPr>
                 <w:rFonts w:ascii="Arial" w:eastAsia="Arial" w:hAnsi="Arial" w:cs="Arial"/>
-                <w:sz w:val="14"/>
-                <w:szCs w:val="14"/>
+                <w:sz w:val="18"/>
+                <w:szCs w:val="18"/>
               </w:rPr>
               <w:t>}</w:t>
             </w:r>
@@ -2241,8 +2169,8 @@
         <w:tc>
           <w:tcPr>
             <w:tcW w:w="0" w:type="auto"/>
-            <w:tcBorders>
-              <w:top w:val="single" w:sz="4" w:space="0" w:color="000000"/>
+            <w:vMerge/>
+            <w:tcBorders>
               <w:left w:val="single" w:sz="12" w:space="0" w:color="000000"/>
               <w:bottom w:val="single" w:sz="4" w:space="0" w:color="000000"/>
               <w:right w:val="single" w:sz="12" w:space="0" w:color="000000"/>
@@ -2305,12 +2233,6 @@
         </w:tc>
       </w:tr>
       <w:tr>
-        <w:tblPrEx>
-          <w:tblCellMar>
-            <w:top w:w="0" w:type="dxa"/>
-            <w:bottom w:w="0" w:type="dxa"/>
-          </w:tblCellMar>
-        </w:tblPrEx>
         <w:tc>
           <w:tcPr>
             <w:tcW w:w="0" w:type="auto"/>
@@ -2353,12 +2275,6 @@
         </w:tc>
       </w:tr>
       <w:tr>
-        <w:tblPrEx>
-          <w:tblCellMar>
-            <w:top w:w="0" w:type="dxa"/>
-            <w:bottom w:w="0" w:type="dxa"/>
-          </w:tblCellMar>
-        </w:tblPrEx>
         <w:tc>
           <w:tcPr>
             <w:tcW w:w="0" w:type="auto"/>
@@ -2409,12 +2325,6 @@
         </w:tc>
       </w:tr>
       <w:tr>
-        <w:tblPrEx>
-          <w:tblCellMar>
-            <w:top w:w="0" w:type="dxa"/>
-            <w:bottom w:w="0" w:type="dxa"/>
-          </w:tblCellMar>
-        </w:tblPrEx>
         <w:trPr>
           <w:trHeight w:val="113"/>
         </w:trPr>
@@ -2508,12 +2418,6 @@
         </w:tc>
       </w:tr>
       <w:tr>
-        <w:tblPrEx>
-          <w:tblCellMar>
-            <w:top w:w="0" w:type="dxa"/>
-            <w:bottom w:w="0" w:type="dxa"/>
-          </w:tblCellMar>
-        </w:tblPrEx>
         <w:trPr>
           <w:trHeight w:val="113"/>
         </w:trPr>
@@ -2583,12 +2487,6 @@
         </w:tc>
       </w:tr>
       <w:tr>
-        <w:tblPrEx>
-          <w:tblCellMar>
-            <w:top w:w="0" w:type="dxa"/>
-            <w:bottom w:w="0" w:type="dxa"/>
-          </w:tblCellMar>
-        </w:tblPrEx>
         <w:trPr>
           <w:trHeight w:val="113"/>
         </w:trPr>
@@ -2658,12 +2556,6 @@
         </w:tc>
       </w:tr>
       <w:tr>
-        <w:tblPrEx>
-          <w:tblCellMar>
-            <w:top w:w="0" w:type="dxa"/>
-            <w:bottom w:w="0" w:type="dxa"/>
-          </w:tblCellMar>
-        </w:tblPrEx>
         <w:trPr>
           <w:trHeight w:val="37"/>
         </w:trPr>
@@ -2733,12 +2625,6 @@
         </w:tc>
       </w:tr>
       <w:tr>
-        <w:tblPrEx>
-          <w:tblCellMar>
-            <w:top w:w="0" w:type="dxa"/>
-            <w:bottom w:w="0" w:type="dxa"/>
-          </w:tblCellMar>
-        </w:tblPrEx>
         <w:trPr>
           <w:trHeight w:val="113"/>
         </w:trPr>
@@ -2826,12 +2712,6 @@
         </w:tc>
       </w:tr>
       <w:tr>
-        <w:tblPrEx>
-          <w:tblCellMar>
-            <w:top w:w="0" w:type="dxa"/>
-            <w:bottom w:w="0" w:type="dxa"/>
-          </w:tblCellMar>
-        </w:tblPrEx>
         <w:trPr>
           <w:trHeight w:val="146"/>
         </w:trPr>
@@ -2901,12 +2781,6 @@
         </w:tc>
       </w:tr>
       <w:tr>
-        <w:tblPrEx>
-          <w:tblCellMar>
-            <w:top w:w="0" w:type="dxa"/>
-            <w:bottom w:w="0" w:type="dxa"/>
-          </w:tblCellMar>
-        </w:tblPrEx>
         <w:tc>
           <w:tcPr>
             <w:tcW w:w="0" w:type="auto"/>
@@ -2957,12 +2831,6 @@
         </w:tc>
       </w:tr>
       <w:tr>
-        <w:tblPrEx>
-          <w:tblCellMar>
-            <w:top w:w="0" w:type="dxa"/>
-            <w:bottom w:w="0" w:type="dxa"/>
-          </w:tblCellMar>
-        </w:tblPrEx>
         <w:tc>
           <w:tcPr>
             <w:tcW w:w="0" w:type="auto"/>
@@ -3029,12 +2897,6 @@
         </w:tc>
       </w:tr>
       <w:tr>
-        <w:tblPrEx>
-          <w:tblCellMar>
-            <w:top w:w="0" w:type="dxa"/>
-            <w:bottom w:w="0" w:type="dxa"/>
-          </w:tblCellMar>
-        </w:tblPrEx>
         <w:tc>
           <w:tcPr>
             <w:tcW w:w="0" w:type="auto"/>
@@ -3101,12 +2963,6 @@
         </w:tc>
       </w:tr>
       <w:tr>
-        <w:tblPrEx>
-          <w:tblCellMar>
-            <w:top w:w="0" w:type="dxa"/>
-            <w:bottom w:w="0" w:type="dxa"/>
-          </w:tblCellMar>
-        </w:tblPrEx>
         <w:tc>
           <w:tcPr>
             <w:tcW w:w="0" w:type="auto"/>
@@ -3173,12 +3029,6 @@
         </w:tc>
       </w:tr>
       <w:tr>
-        <w:tblPrEx>
-          <w:tblCellMar>
-            <w:top w:w="0" w:type="dxa"/>
-            <w:bottom w:w="0" w:type="dxa"/>
-          </w:tblCellMar>
-        </w:tblPrEx>
         <w:tc>
           <w:tcPr>
             <w:tcW w:w="0" w:type="auto"/>
@@ -3229,12 +3079,6 @@
         </w:tc>
       </w:tr>
       <w:tr>
-        <w:tblPrEx>
-          <w:tblCellMar>
-            <w:top w:w="0" w:type="dxa"/>
-            <w:bottom w:w="0" w:type="dxa"/>
-          </w:tblCellMar>
-        </w:tblPrEx>
         <w:tc>
           <w:tcPr>
             <w:tcW w:w="0" w:type="auto"/>
@@ -3301,12 +3145,6 @@
         </w:tc>
       </w:tr>
       <w:tr>
-        <w:tblPrEx>
-          <w:tblCellMar>
-            <w:top w:w="0" w:type="dxa"/>
-            <w:bottom w:w="0" w:type="dxa"/>
-          </w:tblCellMar>
-        </w:tblPrEx>
         <w:tc>
           <w:tcPr>
             <w:tcW w:w="0" w:type="auto"/>
@@ -3373,12 +3211,6 @@
         </w:tc>
       </w:tr>
       <w:tr>
-        <w:tblPrEx>
-          <w:tblCellMar>
-            <w:top w:w="0" w:type="dxa"/>
-            <w:bottom w:w="0" w:type="dxa"/>
-          </w:tblCellMar>
-        </w:tblPrEx>
         <w:tc>
           <w:tcPr>
             <w:tcW w:w="0" w:type="auto"/>
@@ -3445,12 +3277,6 @@
         </w:tc>
       </w:tr>
       <w:tr>
-        <w:tblPrEx>
-          <w:tblCellMar>
-            <w:top w:w="0" w:type="dxa"/>
-            <w:bottom w:w="0" w:type="dxa"/>
-          </w:tblCellMar>
-        </w:tblPrEx>
         <w:tc>
           <w:tcPr>
             <w:tcW w:w="0" w:type="auto"/>
@@ -3501,12 +3327,6 @@
         </w:tc>
       </w:tr>
       <w:tr>
-        <w:tblPrEx>
-          <w:tblCellMar>
-            <w:top w:w="0" w:type="dxa"/>
-            <w:bottom w:w="0" w:type="dxa"/>
-          </w:tblCellMar>
-        </w:tblPrEx>
         <w:tc>
           <w:tcPr>
             <w:tcW w:w="0" w:type="auto"/>
@@ -3573,12 +3393,6 @@
         </w:tc>
       </w:tr>
       <w:tr>
-        <w:tblPrEx>
-          <w:tblCellMar>
-            <w:top w:w="0" w:type="dxa"/>
-            <w:bottom w:w="0" w:type="dxa"/>
-          </w:tblCellMar>
-        </w:tblPrEx>
         <w:tc>
           <w:tcPr>
             <w:tcW w:w="0" w:type="auto"/>
@@ -3629,12 +3443,6 @@
         </w:tc>
       </w:tr>
       <w:tr>
-        <w:tblPrEx>
-          <w:tblCellMar>
-            <w:top w:w="0" w:type="dxa"/>
-            <w:bottom w:w="0" w:type="dxa"/>
-          </w:tblCellMar>
-        </w:tblPrEx>
         <w:tc>
           <w:tcPr>
             <w:tcW w:w="0" w:type="auto"/>
@@ -3701,12 +3509,6 @@
         </w:tc>
       </w:tr>
       <w:tr>
-        <w:tblPrEx>
-          <w:tblCellMar>
-            <w:top w:w="0" w:type="dxa"/>
-            <w:bottom w:w="0" w:type="dxa"/>
-          </w:tblCellMar>
-        </w:tblPrEx>
         <w:tc>
           <w:tcPr>
             <w:tcW w:w="0" w:type="auto"/>
@@ -3749,14 +3551,8 @@
         </w:tc>
       </w:tr>
       <w:tr>
-        <w:tblPrEx>
-          <w:tblCellMar>
-            <w:top w:w="0" w:type="dxa"/>
-            <w:bottom w:w="0" w:type="dxa"/>
-          </w:tblCellMar>
-        </w:tblPrEx>
         <w:trPr>
-          <w:trHeight w:val="925"/>
+          <w:trHeight w:val="841"/>
         </w:trPr>
         <w:tc>
           <w:tcPr>
@@ -3786,18 +3582,126 @@
             </w:pPr>
             <w:r>
               <w:rPr>
+                <w:rFonts w:ascii="Arial" w:eastAsia="Arial" w:hAnsi="Arial" w:cs="Arial"/>
+                <w:sz w:val="14"/>
+                <w:szCs w:val="14"/>
+              </w:rPr>
+              <w:t xml:space="preserve">Mediante la presente dejo constancia que el </w:t>
+            </w:r>
+            <w:r>
+              <w:rPr>
+                <w:rFonts w:ascii="Arial" w:eastAsia="Arial" w:hAnsi="Arial" w:cs="Arial"/>
+                <w:sz w:val="14"/>
+                <w:szCs w:val="14"/>
+              </w:rPr>
+              <w:t>equipo (</w:t>
+            </w:r>
+            <w:r>
+              <w:rPr>
+                <w:rFonts w:ascii="Arial" w:eastAsia="Arial" w:hAnsi="Arial" w:cs="Arial"/>
+                <w:sz w:val="14"/>
+                <w:szCs w:val="14"/>
+              </w:rPr>
+              <w:t xml:space="preserve">CPU, Monitor, Teclado y </w:t>
+            </w:r>
+            <w:proofErr w:type="gramStart"/>
+            <w:r>
+              <w:rPr>
+                <w:rFonts w:ascii="Arial" w:eastAsia="Arial" w:hAnsi="Arial" w:cs="Arial"/>
+                <w:sz w:val="14"/>
+                <w:szCs w:val="14"/>
+              </w:rPr>
+              <w:t>Mouse</w:t>
+            </w:r>
+            <w:proofErr w:type="gramEnd"/>
+            <w:r>
+              <w:rPr>
+                <w:rFonts w:ascii="Arial" w:eastAsia="Arial" w:hAnsi="Arial" w:cs="Arial"/>
+                <w:sz w:val="14"/>
+                <w:szCs w:val="14"/>
+              </w:rPr>
+              <w:t>) ha recibido el mantenimiento preventivo quedando operativo.</w:t>
+            </w:r>
+          </w:p>
+        </w:tc>
+      </w:tr>
+      <w:tr>
+        <w:tc>
+          <w:tcPr>
+            <w:tcW w:w="5039" w:type="dxa"/>
+            <w:gridSpan w:val="4"/>
+            <w:tcBorders>
+              <w:top w:val="single" w:sz="12" w:space="0" w:color="000000"/>
+              <w:left w:val="single" w:sz="8" w:space="0" w:color="auto"/>
+              <w:bottom w:val="single" w:sz="8" w:space="0" w:color="FFFFFF" w:themeColor="background1"/>
+              <w:right w:val="single" w:sz="8" w:space="0" w:color="FFFFFF" w:themeColor="background1"/>
+            </w:tcBorders>
+            <w:tcMar>
+              <w:top w:w="60" w:type="dxa"/>
+              <w:left w:w="100" w:type="dxa"/>
+              <w:bottom w:w="60" w:type="dxa"/>
+              <w:right w:w="100" w:type="dxa"/>
+            </w:tcMar>
+            <w:vAlign w:val="center"/>
+          </w:tcPr>
+          <w:p>
+            <w:pPr>
+              <w:jc w:val="center"/>
+              <w:rPr>
+                <w:sz w:val="14"/>
+                <w:szCs w:val="14"/>
+              </w:rPr>
+            </w:pPr>
+            <w:r>
+              <w:rPr>
+                <w:rFonts w:ascii="Arial" w:eastAsia="Arial" w:hAnsi="Arial" w:cs="Arial"/>
+                <w:sz w:val="14"/>
+                <w:szCs w:val="14"/>
+              </w:rPr>
+              <w:t>Firma del responsable</w:t>
+            </w:r>
+          </w:p>
+        </w:tc>
+        <w:tc>
+          <w:tcPr>
+            <w:tcW w:w="5751" w:type="dxa"/>
+            <w:gridSpan w:val="5"/>
+            <w:tcBorders>
+              <w:top w:val="single" w:sz="12" w:space="0" w:color="000000"/>
+              <w:left w:val="single" w:sz="8" w:space="0" w:color="FFFFFF" w:themeColor="background1"/>
+              <w:bottom w:val="single" w:sz="8" w:space="0" w:color="FFFFFF" w:themeColor="background1"/>
+              <w:right w:val="single" w:sz="8" w:space="0" w:color="000000" w:themeColor="text1"/>
+            </w:tcBorders>
+            <w:tcMar>
+              <w:top w:w="60" w:type="dxa"/>
+              <w:left w:w="100" w:type="dxa"/>
+              <w:bottom w:w="60" w:type="dxa"/>
+              <w:right w:w="100" w:type="dxa"/>
+            </w:tcMar>
+            <w:vAlign w:val="center"/>
+          </w:tcPr>
+          <w:p>
+            <w:pPr>
+              <w:jc w:val="center"/>
+              <w:rPr>
+                <w:sz w:val="14"/>
+                <w:szCs w:val="14"/>
+              </w:rPr>
+            </w:pPr>
+            <w:r>
+              <w:rPr>
                 <w:noProof/>
               </w:rPr>
               <w:drawing>
-                <wp:anchor distT="0" distB="0" distL="114300" distR="114300" simplePos="0" relativeHeight="251659264" behindDoc="0" locked="0" layoutInCell="1" allowOverlap="1" wp14:anchorId="3B02458E" wp14:editId="6A0C980D">
+                <wp:anchor distT="0" distB="0" distL="114300" distR="114300" simplePos="0" relativeHeight="251659264" behindDoc="0" locked="0" layoutInCell="1" allowOverlap="1" wp14:anchorId="3B02458E" wp14:editId="095DB38E">
                   <wp:simplePos x="0" y="0"/>
                   <wp:positionH relativeFrom="column">
-                    <wp:posOffset>4159056</wp:posOffset>
+                    <wp:posOffset>424815</wp:posOffset>
                   </wp:positionH>
                   <wp:positionV relativeFrom="paragraph">
-                    <wp:posOffset>-313607</wp:posOffset>
+                    <wp:posOffset>-1015365</wp:posOffset>
                   </wp:positionV>
-                  <wp:extent cx="1844702" cy="1383370"/>
+                  <wp:extent cx="2028825" cy="1520825"/>
                   <wp:effectExtent l="0" t="0" r="0" b="0"/>
                   <wp:wrapNone/>
                   <wp:docPr id="751942345" name="Picture 1"/>
@@ -3829,7 +3733,7 @@
                         <pic:spPr bwMode="auto">
                           <a:xfrm>
                             <a:off x="0" y="0"/>
-                            <a:ext cx="1844702" cy="1383370"/>
+                            <a:ext cx="2028825" cy="1520825"/>
                           </a:xfrm>
                           <a:prstGeom prst="rect">
                             <a:avLst/>
@@ -3857,134 +3761,12 @@
                 <w:sz w:val="14"/>
                 <w:szCs w:val="14"/>
               </w:rPr>
-              <w:t xml:space="preserve">Mediante la presente dejo constancia que el </w:t>
-            </w:r>
-            <w:proofErr w:type="gramStart"/>
-            <w:r>
-              <w:rPr>
-                <w:rFonts w:ascii="Arial" w:eastAsia="Arial" w:hAnsi="Arial" w:cs="Arial"/>
-                <w:sz w:val="14"/>
-                <w:szCs w:val="14"/>
-              </w:rPr>
-              <w:t>equipo(</w:t>
-            </w:r>
-            <w:proofErr w:type="gramEnd"/>
-            <w:r>
-              <w:rPr>
-                <w:rFonts w:ascii="Arial" w:eastAsia="Arial" w:hAnsi="Arial" w:cs="Arial"/>
-                <w:sz w:val="14"/>
-                <w:szCs w:val="14"/>
-              </w:rPr>
-              <w:t xml:space="preserve">CPU, Monitor, Teclado y </w:t>
-            </w:r>
-            <w:proofErr w:type="gramStart"/>
-            <w:r>
-              <w:rPr>
-                <w:rFonts w:ascii="Arial" w:eastAsia="Arial" w:hAnsi="Arial" w:cs="Arial"/>
-                <w:sz w:val="14"/>
-                <w:szCs w:val="14"/>
-              </w:rPr>
-              <w:t>Mouse</w:t>
-            </w:r>
-            <w:proofErr w:type="gramEnd"/>
-            <w:r>
-              <w:rPr>
-                <w:rFonts w:ascii="Arial" w:eastAsia="Arial" w:hAnsi="Arial" w:cs="Arial"/>
-                <w:sz w:val="14"/>
-                <w:szCs w:val="14"/>
-              </w:rPr>
-              <w:t>) ha recibido el mantenimiento preventivo quedando operativo.</w:t>
+              <w:t>Firma del técnico</w:t>
             </w:r>
           </w:p>
         </w:tc>
       </w:tr>
       <w:tr>
-        <w:tblPrEx>
-          <w:tblCellMar>
-            <w:top w:w="0" w:type="dxa"/>
-            <w:bottom w:w="0" w:type="dxa"/>
-          </w:tblCellMar>
-        </w:tblPrEx>
-        <w:tc>
-          <w:tcPr>
-            <w:tcW w:w="5039" w:type="dxa"/>
-            <w:gridSpan w:val="4"/>
-            <w:tcBorders>
-              <w:top w:val="single" w:sz="12" w:space="0" w:color="000000"/>
-              <w:left w:val="single" w:sz="8" w:space="0" w:color="auto"/>
-              <w:bottom w:val="single" w:sz="8" w:space="0" w:color="FFFFFF" w:themeColor="background1"/>
-              <w:right w:val="single" w:sz="8" w:space="0" w:color="FFFFFF" w:themeColor="background1"/>
-            </w:tcBorders>
-            <w:tcMar>
-              <w:top w:w="60" w:type="dxa"/>
-              <w:left w:w="100" w:type="dxa"/>
-              <w:bottom w:w="60" w:type="dxa"/>
-              <w:right w:w="100" w:type="dxa"/>
-            </w:tcMar>
-            <w:vAlign w:val="center"/>
-          </w:tcPr>
-          <w:p>
-            <w:pPr>
-              <w:jc w:val="center"/>
-              <w:rPr>
-                <w:sz w:val="14"/>
-                <w:szCs w:val="14"/>
-              </w:rPr>
-            </w:pPr>
-            <w:r>
-              <w:rPr>
-                <w:rFonts w:ascii="Arial" w:eastAsia="Arial" w:hAnsi="Arial" w:cs="Arial"/>
-                <w:sz w:val="14"/>
-                <w:szCs w:val="14"/>
-              </w:rPr>
-              <w:t>Firma del responsable</w:t>
-            </w:r>
-          </w:p>
-        </w:tc>
-        <w:tc>
-          <w:tcPr>
-            <w:tcW w:w="5751" w:type="dxa"/>
-            <w:gridSpan w:val="5"/>
-            <w:tcBorders>
-              <w:top w:val="single" w:sz="12" w:space="0" w:color="000000"/>
-              <w:left w:val="single" w:sz="8" w:space="0" w:color="FFFFFF" w:themeColor="background1"/>
-              <w:bottom w:val="single" w:sz="8" w:space="0" w:color="FFFFFF" w:themeColor="background1"/>
-              <w:right w:val="single" w:sz="8" w:space="0" w:color="000000" w:themeColor="text1"/>
-            </w:tcBorders>
-            <w:tcMar>
-              <w:top w:w="60" w:type="dxa"/>
-              <w:left w:w="100" w:type="dxa"/>
-              <w:bottom w:w="60" w:type="dxa"/>
-              <w:right w:w="100" w:type="dxa"/>
-            </w:tcMar>
-            <w:vAlign w:val="center"/>
-          </w:tcPr>
-          <w:p>
-            <w:pPr>
-              <w:jc w:val="center"/>
-              <w:rPr>
-                <w:sz w:val="14"/>
-                <w:szCs w:val="14"/>
-              </w:rPr>
-            </w:pPr>
-            <w:r>
-              <w:rPr>
-                <w:rFonts w:ascii="Arial" w:eastAsia="Arial" w:hAnsi="Arial" w:cs="Arial"/>
-                <w:sz w:val="14"/>
-                <w:szCs w:val="14"/>
-              </w:rPr>
-              <w:t>Firma del técnico</w:t>
-            </w:r>
-          </w:p>
-        </w:tc>
-      </w:tr>
-      <w:tr>
-        <w:tblPrEx>
-          <w:tblCellMar>
-            <w:top w:w="0" w:type="dxa"/>
-            <w:bottom w:w="0" w:type="dxa"/>
-          </w:tblCellMar>
-        </w:tblPrEx>
         <w:trPr>
           <w:trHeight w:val="139"/>
         </w:trPr>
@@ -4009,23 +3791,23 @@
           <w:p>
             <w:pPr>
               <w:rPr>
-                <w:sz w:val="14"/>
-                <w:szCs w:val="14"/>
-              </w:rPr>
-            </w:pPr>
-            <w:r>
-              <w:rPr>
-                <w:rFonts w:ascii="Arial" w:eastAsia="Arial" w:hAnsi="Arial" w:cs="Arial"/>
-                <w:sz w:val="14"/>
-                <w:szCs w:val="14"/>
+                <w:sz w:val="18"/>
+                <w:szCs w:val="18"/>
+              </w:rPr>
+            </w:pPr>
+            <w:r>
+              <w:rPr>
+                <w:rFonts w:ascii="Arial" w:eastAsia="Arial" w:hAnsi="Arial" w:cs="Arial"/>
+                <w:sz w:val="18"/>
+                <w:szCs w:val="18"/>
               </w:rPr>
               <w:t>Nombre</w:t>
             </w:r>
             <w:r>
               <w:rPr>
                 <w:rFonts w:ascii="Arial" w:eastAsia="Arial" w:hAnsi="Arial" w:cs="Arial"/>
-                <w:sz w:val="14"/>
-                <w:szCs w:val="14"/>
+                <w:sz w:val="18"/>
+                <w:szCs w:val="18"/>
               </w:rPr>
               <w:t>:</w:t>
             </w:r>
@@ -4052,44 +3834,30 @@
           <w:p>
             <w:pPr>
               <w:rPr>
-                <w:sz w:val="14"/>
-                <w:szCs w:val="14"/>
-              </w:rPr>
-            </w:pPr>
-            <w:r>
-              <w:rPr>
-                <w:rFonts w:ascii="Arial" w:eastAsia="Arial" w:hAnsi="Arial" w:cs="Arial"/>
-                <w:sz w:val="14"/>
-                <w:szCs w:val="14"/>
+                <w:sz w:val="18"/>
+                <w:szCs w:val="18"/>
+              </w:rPr>
+            </w:pPr>
+            <w:r>
+              <w:rPr>
+                <w:rFonts w:ascii="Arial" w:eastAsia="Arial" w:hAnsi="Arial" w:cs="Arial"/>
+                <w:sz w:val="18"/>
+                <w:szCs w:val="18"/>
               </w:rPr>
               <w:t>Nombre</w:t>
             </w:r>
             <w:r>
               <w:rPr>
                 <w:rFonts w:ascii="Arial" w:eastAsia="Arial" w:hAnsi="Arial" w:cs="Arial"/>
-                <w:sz w:val="14"/>
-                <w:szCs w:val="14"/>
-              </w:rPr>
-              <w:t>: Daniel Stip Sarmiento V</w:t>
-            </w:r>
-            <w:r>
-              <w:rPr>
-                <w:rFonts w:ascii="Arial" w:eastAsia="Arial" w:hAnsi="Arial" w:cs="Arial"/>
-                <w:sz w:val="14"/>
-                <w:szCs w:val="14"/>
-              </w:rPr>
-              <w:t>aldez</w:t>
+                <w:sz w:val="18"/>
+                <w:szCs w:val="18"/>
+              </w:rPr>
+              <w:t>: Daniel Stip Sarmiento Valdez</w:t>
             </w:r>
           </w:p>
         </w:tc>
       </w:tr>
       <w:tr>
-        <w:tblPrEx>
-          <w:tblCellMar>
-            <w:top w:w="0" w:type="dxa"/>
-            <w:bottom w:w="0" w:type="dxa"/>
-          </w:tblCellMar>
-        </w:tblPrEx>
         <w:trPr>
           <w:trHeight w:val="15"/>
         </w:trPr>
@@ -4114,23 +3882,23 @@
           <w:p>
             <w:pPr>
               <w:rPr>
-                <w:sz w:val="14"/>
-                <w:szCs w:val="14"/>
-              </w:rPr>
-            </w:pPr>
-            <w:r>
-              <w:rPr>
-                <w:rFonts w:ascii="Arial" w:eastAsia="Arial" w:hAnsi="Arial" w:cs="Arial"/>
-                <w:sz w:val="14"/>
-                <w:szCs w:val="14"/>
+                <w:sz w:val="18"/>
+                <w:szCs w:val="18"/>
+              </w:rPr>
+            </w:pPr>
+            <w:r>
+              <w:rPr>
+                <w:rFonts w:ascii="Arial" w:eastAsia="Arial" w:hAnsi="Arial" w:cs="Arial"/>
+                <w:sz w:val="18"/>
+                <w:szCs w:val="18"/>
               </w:rPr>
               <w:t>DNI</w:t>
             </w:r>
             <w:r>
               <w:rPr>
                 <w:rFonts w:ascii="Arial" w:eastAsia="Arial" w:hAnsi="Arial" w:cs="Arial"/>
-                <w:sz w:val="14"/>
-                <w:szCs w:val="14"/>
+                <w:sz w:val="18"/>
+                <w:szCs w:val="18"/>
               </w:rPr>
               <w:t>:</w:t>
             </w:r>
@@ -4157,23 +3925,23 @@
           <w:p>
             <w:pPr>
               <w:rPr>
-                <w:sz w:val="14"/>
-                <w:szCs w:val="14"/>
-              </w:rPr>
-            </w:pPr>
-            <w:r>
-              <w:rPr>
-                <w:rFonts w:ascii="Arial" w:eastAsia="Arial" w:hAnsi="Arial" w:cs="Arial"/>
-                <w:sz w:val="14"/>
-                <w:szCs w:val="14"/>
+                <w:sz w:val="18"/>
+                <w:szCs w:val="18"/>
+              </w:rPr>
+            </w:pPr>
+            <w:r>
+              <w:rPr>
+                <w:rFonts w:ascii="Arial" w:eastAsia="Arial" w:hAnsi="Arial" w:cs="Arial"/>
+                <w:sz w:val="18"/>
+                <w:szCs w:val="18"/>
               </w:rPr>
               <w:t>DNI</w:t>
             </w:r>
             <w:r>
               <w:rPr>
                 <w:rFonts w:ascii="Arial" w:eastAsia="Arial" w:hAnsi="Arial" w:cs="Arial"/>
-                <w:sz w:val="14"/>
-                <w:szCs w:val="14"/>
+                <w:sz w:val="18"/>
+                <w:szCs w:val="18"/>
               </w:rPr>
               <w:t>: 73312280</w:t>
             </w:r>
@@ -4181,12 +3949,6 @@
         </w:tc>
       </w:tr>
       <w:tr>
-        <w:tblPrEx>
-          <w:tblCellMar>
-            <w:top w:w="0" w:type="dxa"/>
-            <w:bottom w:w="0" w:type="dxa"/>
-          </w:tblCellMar>
-        </w:tblPrEx>
         <w:trPr>
           <w:trHeight w:val="568"/>
         </w:trPr>
@@ -4210,8 +3972,8 @@
             <w:r>
               <w:rPr>
                 <w:rFonts w:ascii="Arial" w:eastAsia="Arial" w:hAnsi="Arial" w:cs="Arial"/>
-                <w:sz w:val="14"/>
-                <w:szCs w:val="14"/>
+                <w:sz w:val="18"/>
+                <w:szCs w:val="18"/>
               </w:rPr>
               <w:t>Observaciones:</w:t>
             </w:r>

</xml_diff>